<commit_message>
feat: CRM Phase 1 + auto lead capture + dashboard; refresh investor & status docs  - CRM: leads, 11-stage pipeline, lead profiles, tasks, management dashboard - auto lead capture: ingest-lead edge function + Telegram crm_capture (scoring + dedupe) - docs: regenerate EBI_Platform_Investor_Report.docx; add ebi_live_status.html (live artifact); update framework checklist
</commit_message>
<xml_diff>
--- a/EBI_Platform_Investor_Report.docx
+++ b/EBI_Platform_Investor_Report.docx
@@ -9,7 +9,6 @@
       </w:pPr>
       <w:r>
         <w:rPr>
-          <w:rFonts w:ascii="Arial" w:cs="Arial" w:eastAsia="Arial" w:hAnsi="Arial"/>
           <w:b/>
           <w:bCs/>
           <w:color w:val="1A1A2E"/>
@@ -46,7 +45,7 @@
           <w:sz w:val="34"/>
           <w:szCs w:val="34"/>
         </w:rPr>
-        <w:t xml:space="preserve">AI &amp; Automation Platform</w:t>
+        <w:t xml:space="preserve">AI, Automation &amp; CRM Platform</w:t>
       </w:r>
     </w:p>
     <w:p>
@@ -107,7 +106,7 @@
         <w:spacing w:after="140"/>
       </w:pPr>
       <w:r>
-        <w:t xml:space="preserve">Elite By Infinity (EBI) has invested in building a proprietary, production-grade artificial-intelligence and automation platform that powers its trading-education community end to end. What is often dismissed as “just a chatbot” is, in reality, a multi-service distributed system: real-time market intelligence, autonomous community engagement, lead intelligence, and a custom administration platform with enterprise-style security and governance.</w:t>
+        <w:t xml:space="preserve">Elite By Infinity (EBI) has built and deployed a proprietary AI, automation and CRM platform that runs its trading-education business end to end. This is not an off-the-shelf assembly of third-party tools — it is an integrated, production system in which marketing, community engagement, lead intelligence and customer management all share a single secured database that EBI owns outright.</w:t>
       </w:r>
     </w:p>
     <w:p>
@@ -115,7 +114,7 @@
         <w:spacing w:after="140"/>
       </w:pPr>
       <w:r>
-        <w:t xml:space="preserve">The platform has been engineered for reliability, safety and scale from the ground up. It runs continuously in the cloud, integrates large-language-model AI under strict human oversight, and is backed by a hardened database layer with row-level security. Crucially, it is designed so that non-technical team members can operate and grow it without engineering support — while a single owner retains full approval authority over everything the system says to the public.</w:t>
+        <w:t xml:space="preserve">Since the last review the platform has advanced from concept to operational. Two AI bots run continuously in the cloud; a custom, governed administration platform lets the team manage everything the bots say without touching code; and a purpose-built CRM now captures and tracks every lead from first contact through the sales pipeline. The result is infrastructure that scales the business without scaling headcount at the same rate.</w:t>
       </w:r>
     </w:p>
     <w:p>
@@ -123,7 +122,7 @@
         <w:spacing w:after="140"/>
       </w:pPr>
       <w:r>
-        <w:t xml:space="preserve">This document summarises the scope of work delivered to date, the engineering depth behind it, and the roadmap that turns this foundation into a defensible, compounding asset.</w:t>
+        <w:t xml:space="preserve">This document summarises what has been delivered, the engineering behind it, and the roadmap that compounds this foundation into a durable, defensible asset.</w:t>
       </w:r>
     </w:p>
     <w:p>
@@ -131,7 +130,7 @@
         <w:pStyle w:val="Heading1"/>
       </w:pPr>
       <w:r>
-        <w:t xml:space="preserve">What has been built</w:t>
+        <w:t xml:space="preserve">What has been built and deployed</w:t>
       </w:r>
     </w:p>
     <w:p>
@@ -139,7 +138,7 @@
         <w:pStyle w:val="Heading2"/>
       </w:pPr>
       <w:r>
-        <w:t xml:space="preserve">1. AI Market Intelligence Bot</w:t>
+        <w:t xml:space="preserve">1. AI Market Intelligence Bot — live</w:t>
       </w:r>
     </w:p>
     <w:p>
@@ -147,59 +146,46 @@
         <w:spacing w:after="140"/>
       </w:pPr>
       <w:r>
-        <w:t xml:space="preserve">An autonomous market-analysis engine focused on Gold (XAUUSD) and the US macroeconomic backdrop that drives it. It continuously aggregates news from multiple independent sources, filters for high-impact signals, and uses AI to compress them into concise, professional, bilingual market updates.</w:t>
-      </w:r>
-    </w:p>
-    <w:p>
-      <w:pPr>
-        <w:pStyle w:val="ListParagraph"/>
-        <w:numPr>
-          <w:ilvl w:val="0"/>
-          <w:numId w:val="2"/>
-        </w:numPr>
-        <w:spacing w:after="60"/>
-      </w:pPr>
-      <w:r>
-        <w:t xml:space="preserve">Multi-source ingestion: live news feeds plus a high-impact economic calendar, de-duplicated and relevance-filtered.</w:t>
-      </w:r>
-    </w:p>
-    <w:p>
-      <w:pPr>
-        <w:pStyle w:val="ListParagraph"/>
-        <w:numPr>
-          <w:ilvl w:val="0"/>
-          <w:numId w:val="2"/>
-        </w:numPr>
-        <w:spacing w:after="60"/>
-      </w:pPr>
-      <w:r>
-        <w:t xml:space="preserve">AI summarisation across three distinct analytical lenses (technical, fundamental, sentiment) for editorial variety.</w:t>
-      </w:r>
-    </w:p>
-    <w:p>
-      <w:pPr>
-        <w:pStyle w:val="ListParagraph"/>
-        <w:numPr>
-          <w:ilvl w:val="0"/>
-          <w:numId w:val="2"/>
-        </w:numPr>
-        <w:spacing w:after="60"/>
-      </w:pPr>
-      <w:r>
-        <w:t xml:space="preserve">Breaking-news intelligence: six times daily, the AI ranks the three most market-moving stories and routes them for a one-tap human decision — with automatic fallback if no decision is made.</w:t>
-      </w:r>
-    </w:p>
-    <w:p>
-      <w:pPr>
-        <w:pStyle w:val="ListParagraph"/>
-        <w:numPr>
-          <w:ilvl w:val="0"/>
-          <w:numId w:val="2"/>
-        </w:numPr>
-        <w:spacing w:after="60"/>
-      </w:pPr>
-      <w:r>
-        <w:t xml:space="preserve">Scheduled briefings and pre-event alerts, fully timezone-aware, published in both English and Simplified Chinese.</w:t>
+        <w:t xml:space="preserve">An autonomous analysis engine for Gold (XAUUSD) and the US macro backdrop. It aggregates multiple live news sources, filters for high-impact signals, and uses AI to publish concise, professional, bilingual market updates on a fixed schedule.</w:t>
+      </w:r>
+    </w:p>
+    <w:p>
+      <w:pPr>
+        <w:pStyle w:val="ListParagraph"/>
+        <w:numPr>
+          <w:ilvl w:val="0"/>
+          <w:numId w:val="2"/>
+        </w:numPr>
+        <w:spacing w:after="60"/>
+      </w:pPr>
+      <w:r>
+        <w:t xml:space="preserve">Multi-source ingestion plus a high-impact economic-event calendar, de-duplicated and relevance-filtered.</w:t>
+      </w:r>
+    </w:p>
+    <w:p>
+      <w:pPr>
+        <w:pStyle w:val="ListParagraph"/>
+        <w:numPr>
+          <w:ilvl w:val="0"/>
+          <w:numId w:val="2"/>
+        </w:numPr>
+        <w:spacing w:after="60"/>
+      </w:pPr>
+      <w:r>
+        <w:t xml:space="preserve">Six-times-daily breaking-news intelligence: the AI ranks the three most market-moving stories for a one-tap human decision, with automatic fallback if no decision is made.</w:t>
+      </w:r>
+    </w:p>
+    <w:p>
+      <w:pPr>
+        <w:pStyle w:val="ListParagraph"/>
+        <w:numPr>
+          <w:ilvl w:val="0"/>
+          <w:numId w:val="2"/>
+        </w:numPr>
+        <w:spacing w:after="60"/>
+      </w:pPr>
+      <w:r>
+        <w:t xml:space="preserve">Every message published in English and Simplified Chinese.</w:t>
       </w:r>
     </w:p>
     <w:p>
@@ -207,7 +193,7 @@
         <w:pStyle w:val="Heading2"/>
       </w:pPr>
       <w:r>
-        <w:t xml:space="preserve">2. AI Community Assistant Bot</w:t>
+        <w:t xml:space="preserve">2. AI Community Assistant Bot — live</w:t>
       </w:r>
     </w:p>
     <w:p>
@@ -215,59 +201,59 @@
         <w:spacing w:after="140"/>
       </w:pPr>
       <w:r>
-        <w:t xml:space="preserve">A 24/7 community manager that makes the group feel active, welcoming and professionally run, while reducing the human admin workload.</w:t>
-      </w:r>
-    </w:p>
-    <w:p>
-      <w:pPr>
-        <w:pStyle w:val="ListParagraph"/>
-        <w:numPr>
-          <w:ilvl w:val="0"/>
-          <w:numId w:val="2"/>
-        </w:numPr>
-        <w:spacing w:after="60"/>
-      </w:pPr>
-      <w:r>
-        <w:t xml:space="preserve">Automated member welcome and a multi-day onboarding education sequence.</w:t>
-      </w:r>
-    </w:p>
-    <w:p>
-      <w:pPr>
-        <w:pStyle w:val="ListParagraph"/>
-        <w:numPr>
-          <w:ilvl w:val="0"/>
-          <w:numId w:val="2"/>
-        </w:numPr>
-        <w:spacing w:after="60"/>
-      </w:pPr>
-      <w:r>
-        <w:t xml:space="preserve">Bilingual AI question-answering on trading concepts, risk management and market events — educational by design, never offering financial advice.</w:t>
-      </w:r>
-    </w:p>
-    <w:p>
-      <w:pPr>
-        <w:pStyle w:val="ListParagraph"/>
-        <w:numPr>
-          <w:ilvl w:val="0"/>
-          <w:numId w:val="2"/>
-        </w:numPr>
-        <w:spacing w:after="60"/>
-      </w:pPr>
-      <w:r>
-        <w:t xml:space="preserve">Lead intelligence: every interaction is scored for buying intent, with high-intent prospects surfaced to the team in real time.</w:t>
-      </w:r>
-    </w:p>
-    <w:p>
-      <w:pPr>
-        <w:pStyle w:val="ListParagraph"/>
-        <w:numPr>
-          <w:ilvl w:val="0"/>
-          <w:numId w:val="2"/>
-        </w:numPr>
-        <w:spacing w:after="60"/>
-      </w:pPr>
-      <w:r>
-        <w:t xml:space="preserve">Automated community moderation, rate-limiting, milestone and re-engagement messaging.</w:t>
+        <w:t xml:space="preserve">A 24/7 community manager that welcomes members, educates them, answers questions, and surfaces sales opportunities — reducing human workload while improving experience.</w:t>
+      </w:r>
+    </w:p>
+    <w:p>
+      <w:pPr>
+        <w:pStyle w:val="ListParagraph"/>
+        <w:numPr>
+          <w:ilvl w:val="0"/>
+          <w:numId w:val="2"/>
+        </w:numPr>
+        <w:spacing w:after="60"/>
+      </w:pPr>
+      <w:r>
+        <w:t xml:space="preserve">Automated welcome and multi-day onboarding education sequence.</w:t>
+      </w:r>
+    </w:p>
+    <w:p>
+      <w:pPr>
+        <w:pStyle w:val="ListParagraph"/>
+        <w:numPr>
+          <w:ilvl w:val="0"/>
+          <w:numId w:val="2"/>
+        </w:numPr>
+        <w:spacing w:after="60"/>
+      </w:pPr>
+      <w:r>
+        <w:t xml:space="preserve">Bilingual AI question-answering, educational by design (never financial advice).</w:t>
+      </w:r>
+    </w:p>
+    <w:p>
+      <w:pPr>
+        <w:pStyle w:val="ListParagraph"/>
+        <w:numPr>
+          <w:ilvl w:val="0"/>
+          <w:numId w:val="2"/>
+        </w:numPr>
+        <w:spacing w:after="60"/>
+      </w:pPr>
+      <w:r>
+        <w:t xml:space="preserve">Real-time lead intelligence: every interaction is scored for buying intent and routed to the team.</w:t>
+      </w:r>
+    </w:p>
+    <w:p>
+      <w:pPr>
+        <w:pStyle w:val="ListParagraph"/>
+        <w:numPr>
+          <w:ilvl w:val="0"/>
+          <w:numId w:val="2"/>
+        </w:numPr>
+        <w:spacing w:after="60"/>
+      </w:pPr>
+      <w:r>
+        <w:t xml:space="preserve">Automated moderation, rate-limiting, and re-engagement messaging.</w:t>
       </w:r>
     </w:p>
     <w:p>
@@ -275,7 +261,7 @@
         <w:pStyle w:val="Heading2"/>
       </w:pPr>
       <w:r>
-        <w:t xml:space="preserve">3. Admin Control Platform</w:t>
+        <w:t xml:space="preserve">3. Admin Control Platform — built &amp; deployed</w:t>
       </w:r>
     </w:p>
     <w:p>
@@ -283,59 +269,59 @@
         <w:spacing w:after="140"/>
       </w:pPr>
       <w:r>
-        <w:t xml:space="preserve">A custom, database-driven control centre that lifts the entire system out of code and into the hands of the team — with governance built in. This is the strategic core: it converts a developer-dependent tool into an operable business asset.</w:t>
-      </w:r>
-    </w:p>
-    <w:p>
-      <w:pPr>
-        <w:pStyle w:val="ListParagraph"/>
-        <w:numPr>
-          <w:ilvl w:val="0"/>
-          <w:numId w:val="2"/>
-        </w:numPr>
-        <w:spacing w:after="60"/>
-      </w:pPr>
-      <w:r>
-        <w:t xml:space="preserve">Every message the bots send is stored as versioned, editable content — no code change required to update what the community sees.</w:t>
-      </w:r>
-    </w:p>
-    <w:p>
-      <w:pPr>
-        <w:pStyle w:val="ListParagraph"/>
-        <w:numPr>
-          <w:ilvl w:val="0"/>
-          <w:numId w:val="2"/>
-        </w:numPr>
-        <w:spacing w:after="60"/>
-      </w:pPr>
-      <w:r>
-        <w:t xml:space="preserve">A strict approval workflow: team editors may draft and submit; only the owner can approve and publish. Nothing reaches the public without sign-off.</w:t>
-      </w:r>
-    </w:p>
-    <w:p>
-      <w:pPr>
-        <w:pStyle w:val="ListParagraph"/>
-        <w:numPr>
-          <w:ilvl w:val="0"/>
-          <w:numId w:val="2"/>
-        </w:numPr>
-        <w:spacing w:after="60"/>
-      </w:pPr>
-      <w:r>
-        <w:t xml:space="preserve">Role-based access enforced at the database level, plus a full audit trail of who changed and approved what.</w:t>
-      </w:r>
-    </w:p>
-    <w:p>
-      <w:pPr>
-        <w:pStyle w:val="ListParagraph"/>
-        <w:numPr>
-          <w:ilvl w:val="0"/>
-          <w:numId w:val="2"/>
-        </w:numPr>
-        <w:spacing w:after="60"/>
-      </w:pPr>
-      <w:r>
-        <w:t xml:space="preserve">Zero-downtime configuration: changes propagate to the live bots automatically, with self-healing fallbacks so the service never breaks.</w:t>
+        <w:t xml:space="preserve">A custom, database-driven control centre — the strategic core that turns a developer-dependent tool into an operable business asset. The team manages all bot content, settings and customer data through a secure web app, with strict governance built in.</w:t>
+      </w:r>
+    </w:p>
+    <w:p>
+      <w:pPr>
+        <w:pStyle w:val="ListParagraph"/>
+        <w:numPr>
+          <w:ilvl w:val="0"/>
+          <w:numId w:val="2"/>
+        </w:numPr>
+        <w:spacing w:after="60"/>
+      </w:pPr>
+      <w:r>
+        <w:t xml:space="preserve">Every member-facing message is versioned, editable content — updated with no code change and no downtime.</w:t>
+      </w:r>
+    </w:p>
+    <w:p>
+      <w:pPr>
+        <w:pStyle w:val="ListParagraph"/>
+        <w:numPr>
+          <w:ilvl w:val="0"/>
+          <w:numId w:val="2"/>
+        </w:numPr>
+        <w:spacing w:after="60"/>
+      </w:pPr>
+      <w:r>
+        <w:t xml:space="preserve">Strict approval workflow: team editors draft and submit; only the owner approves and publishes. Nothing reaches the public without sign-off.</w:t>
+      </w:r>
+    </w:p>
+    <w:p>
+      <w:pPr>
+        <w:pStyle w:val="ListParagraph"/>
+        <w:numPr>
+          <w:ilvl w:val="0"/>
+          <w:numId w:val="2"/>
+        </w:numPr>
+        <w:spacing w:after="60"/>
+      </w:pPr>
+      <w:r>
+        <w:t xml:space="preserve">Role-based access enforced at the database layer, plus a full audit trail.</w:t>
+      </w:r>
+    </w:p>
+    <w:p>
+      <w:pPr>
+        <w:pStyle w:val="ListParagraph"/>
+        <w:numPr>
+          <w:ilvl w:val="0"/>
+          <w:numId w:val="2"/>
+        </w:numPr>
+        <w:spacing w:after="60"/>
+      </w:pPr>
+      <w:r>
+        <w:t xml:space="preserve">Manages all three bots, the FAQ knowledge base, lead-scoring rules, a sent-message log, and the structured education course.</w:t>
       </w:r>
     </w:p>
     <w:p>
@@ -343,7 +329,7 @@
         <w:pStyle w:val="Heading2"/>
       </w:pPr>
       <w:r>
-        <w:t xml:space="preserve">4. Education Bot — 30-day structured course (in progress)</w:t>
+        <w:t xml:space="preserve">4. Customer Relationship Management (CRM) — Phase 1 live</w:t>
       </w:r>
     </w:p>
     <w:p>
@@ -351,7 +337,75 @@
         <w:spacing w:after="140"/>
       </w:pPr>
       <w:r>
-        <w:t xml:space="preserve">A guided, gated learning journey that delivers one lesson per day and requires the learner to confirm completion before the next unlocks — building discipline and retention. Course content is authored by the team and published through the same owner-approved workflow.</w:t>
+        <w:t xml:space="preserve">A trading-native CRM, built on the same owned database, now operational. Unlike a generic CRM bolted on from outside, it unifies marketing leads, community engagement and (in the next phase) trading activity in one place.</w:t>
+      </w:r>
+    </w:p>
+    <w:p>
+      <w:pPr>
+        <w:pStyle w:val="ListParagraph"/>
+        <w:numPr>
+          <w:ilvl w:val="0"/>
+          <w:numId w:val="2"/>
+        </w:numPr>
+        <w:spacing w:after="60"/>
+      </w:pPr>
+      <w:r>
+        <w:t xml:space="preserve">Eleven-stage sales pipeline (New Lead → KYC → Funded → Active Trader) with a drag-and-drop board.</w:t>
+      </w:r>
+    </w:p>
+    <w:p>
+      <w:pPr>
+        <w:pStyle w:val="ListParagraph"/>
+        <w:numPr>
+          <w:ilvl w:val="0"/>
+          <w:numId w:val="2"/>
+        </w:numPr>
+        <w:spacing w:after="60"/>
+      </w:pPr>
+      <w:r>
+        <w:t xml:space="preserve">360° lead profiles with notes, tags, tasks and a full activity timeline.</w:t>
+      </w:r>
+    </w:p>
+    <w:p>
+      <w:pPr>
+        <w:pStyle w:val="ListParagraph"/>
+        <w:numPr>
+          <w:ilvl w:val="0"/>
+          <w:numId w:val="2"/>
+        </w:numPr>
+        <w:spacing w:after="60"/>
+      </w:pPr>
+      <w:r>
+        <w:t xml:space="preserve">Automated multi-channel lead capture: a single secure intake endpoint feeds the pipeline from the website, Telegram, and (when enabled) paid social — with automatic lead-scoring and duplicate detection.</w:t>
+      </w:r>
+    </w:p>
+    <w:p>
+      <w:pPr>
+        <w:pStyle w:val="ListParagraph"/>
+        <w:numPr>
+          <w:ilvl w:val="0"/>
+          <w:numId w:val="2"/>
+        </w:numPr>
+        <w:spacing w:after="60"/>
+      </w:pPr>
+      <w:r>
+        <w:t xml:space="preserve">A management dashboard: pipeline funnel, conversion, lead source and owner performance, and task tracking.</w:t>
+      </w:r>
+    </w:p>
+    <w:p>
+      <w:pPr>
+        <w:pStyle w:val="Heading2"/>
+      </w:pPr>
+      <w:r>
+        <w:t xml:space="preserve">5. Structured Education System — designed, authoring-ready</w:t>
+      </w:r>
+    </w:p>
+    <w:p>
+      <w:pPr>
+        <w:spacing w:after="140"/>
+      </w:pPr>
+      <w:r>
+        <w:t xml:space="preserve">A 30-day guided trading course with a gated daily-drip design (a learner confirms each lesson before the next unlocks). The authoring and approval pipeline is built; content is filled by the team and published under owner approval.</w:t>
       </w:r>
     </w:p>
     <w:p>
@@ -364,7 +418,7 @@
         <w:pStyle w:val="Heading1"/>
       </w:pPr>
       <w:r>
-        <w:t xml:space="preserve">System at a glance</w:t>
+        <w:t xml:space="preserve">Platform at a glance</w:t>
       </w:r>
     </w:p>
     <w:tbl>
@@ -380,14 +434,14 @@
         </w:tblBorders>
       </w:tblPr>
       <w:tblGrid>
-        <w:gridCol w:w="2600"/>
-        <w:gridCol w:w="1600"/>
-        <w:gridCol w:w="5160"/>
+        <w:gridCol w:w="2700"/>
+        <w:gridCol w:w="1700"/>
+        <w:gridCol w:w="4960"/>
       </w:tblGrid>
       <w:tr>
         <w:tc>
           <w:tcPr>
-            <w:tcW w:type="dxa" w:w="2600"/>
+            <w:tcW w:type="dxa" w:w="2700"/>
             <w:tcBorders>
               <w:top w:val="single" w:color="CCCCCC" w:sz="1"/>
               <w:left w:val="single" w:color="CCCCCC" w:sz="1"/>
@@ -415,7 +469,7 @@
         </w:tc>
         <w:tc>
           <w:tcPr>
-            <w:tcW w:type="dxa" w:w="1600"/>
+            <w:tcW w:type="dxa" w:w="1700"/>
             <w:tcBorders>
               <w:top w:val="single" w:color="CCCCCC" w:sz="1"/>
               <w:left w:val="single" w:color="CCCCCC" w:sz="1"/>
@@ -443,7 +497,7 @@
         </w:tc>
         <w:tc>
           <w:tcPr>
-            <w:tcW w:type="dxa" w:w="5160"/>
+            <w:tcW w:type="dxa" w:w="4960"/>
             <w:tcBorders>
               <w:top w:val="single" w:color="CCCCCC" w:sz="1"/>
               <w:left w:val="single" w:color="CCCCCC" w:sz="1"/>
@@ -473,7 +527,7 @@
       <w:tr>
         <w:tc>
           <w:tcPr>
-            <w:tcW w:type="dxa" w:w="2600"/>
+            <w:tcW w:type="dxa" w:w="2700"/>
             <w:tcBorders>
               <w:top w:val="single" w:color="CCCCCC" w:sz="1"/>
               <w:left w:val="single" w:color="CCCCCC" w:sz="1"/>
@@ -499,7 +553,7 @@
         </w:tc>
         <w:tc>
           <w:tcPr>
-            <w:tcW w:type="dxa" w:w="1600"/>
+            <w:tcW w:type="dxa" w:w="1700"/>
             <w:tcBorders>
               <w:top w:val="single" w:color="CCCCCC" w:sz="1"/>
               <w:left w:val="single" w:color="CCCCCC" w:sz="1"/>
@@ -525,27 +579,27 @@
         </w:tc>
         <w:tc>
           <w:tcPr>
-            <w:tcW w:type="dxa" w:w="5160"/>
-            <w:tcBorders>
-              <w:top w:val="single" w:color="CCCCCC" w:sz="1"/>
-              <w:left w:val="single" w:color="CCCCCC" w:sz="1"/>
-              <w:bottom w:val="single" w:color="CCCCCC" w:sz="1"/>
-              <w:right w:val="single" w:color="CCCCCC" w:sz="1"/>
-            </w:tcBorders>
-            <w:tcMar>
-              <w:top w:type="dxa" w:w="80"/>
-              <w:left w:type="dxa" w:w="120"/>
-              <w:bottom w:type="dxa" w:w="80"/>
-              <w:right w:type="dxa" w:w="120"/>
-            </w:tcMar>
-          </w:tcPr>
-          <w:p>
-            <w:r>
-              <w:rPr>
-                <w:b w:val="false"/>
-                <w:bCs w:val="false"/>
-              </w:rPr>
-              <w:t xml:space="preserve">Automated bilingual Gold / US-macro analysis and breaking-news alerts</w:t>
+            <w:tcW w:type="dxa" w:w="4960"/>
+            <w:tcBorders>
+              <w:top w:val="single" w:color="CCCCCC" w:sz="1"/>
+              <w:left w:val="single" w:color="CCCCCC" w:sz="1"/>
+              <w:bottom w:val="single" w:color="CCCCCC" w:sz="1"/>
+              <w:right w:val="single" w:color="CCCCCC" w:sz="1"/>
+            </w:tcBorders>
+            <w:tcMar>
+              <w:top w:type="dxa" w:w="80"/>
+              <w:left w:type="dxa" w:w="120"/>
+              <w:bottom w:type="dxa" w:w="80"/>
+              <w:right w:type="dxa" w:w="120"/>
+            </w:tcMar>
+          </w:tcPr>
+          <w:p>
+            <w:r>
+              <w:rPr>
+                <w:b w:val="false"/>
+                <w:bCs w:val="false"/>
+              </w:rPr>
+              <w:t xml:space="preserve">Bilingual Gold/US-macro analysis + breaking-news alerts</w:t>
             </w:r>
           </w:p>
         </w:tc>
@@ -553,7 +607,7 @@
       <w:tr>
         <w:tc>
           <w:tcPr>
-            <w:tcW w:type="dxa" w:w="2600"/>
+            <w:tcW w:type="dxa" w:w="2700"/>
             <w:tcBorders>
               <w:top w:val="single" w:color="CCCCCC" w:sz="1"/>
               <w:left w:val="single" w:color="CCCCCC" w:sz="1"/>
@@ -579,7 +633,7 @@
         </w:tc>
         <w:tc>
           <w:tcPr>
-            <w:tcW w:type="dxa" w:w="1600"/>
+            <w:tcW w:type="dxa" w:w="1700"/>
             <w:tcBorders>
               <w:top w:val="single" w:color="CCCCCC" w:sz="1"/>
               <w:left w:val="single" w:color="CCCCCC" w:sz="1"/>
@@ -605,7 +659,7 @@
         </w:tc>
         <w:tc>
           <w:tcPr>
-            <w:tcW w:type="dxa" w:w="5160"/>
+            <w:tcW w:type="dxa" w:w="4960"/>
             <w:tcBorders>
               <w:top w:val="single" w:color="CCCCCC" w:sz="1"/>
               <w:left w:val="single" w:color="CCCCCC" w:sz="1"/>
@@ -633,7 +687,7 @@
       <w:tr>
         <w:tc>
           <w:tcPr>
-            <w:tcW w:type="dxa" w:w="2600"/>
+            <w:tcW w:type="dxa" w:w="2700"/>
             <w:tcBorders>
               <w:top w:val="single" w:color="CCCCCC" w:sz="1"/>
               <w:left w:val="single" w:color="CCCCCC" w:sz="1"/>
@@ -659,53 +713,53 @@
         </w:tc>
         <w:tc>
           <w:tcPr>
-            <w:tcW w:type="dxa" w:w="1600"/>
-            <w:tcBorders>
-              <w:top w:val="single" w:color="CCCCCC" w:sz="1"/>
-              <w:left w:val="single" w:color="CCCCCC" w:sz="1"/>
-              <w:bottom w:val="single" w:color="CCCCCC" w:sz="1"/>
-              <w:right w:val="single" w:color="CCCCCC" w:sz="1"/>
-            </w:tcBorders>
-            <w:tcMar>
-              <w:top w:type="dxa" w:w="80"/>
-              <w:left w:type="dxa" w:w="120"/>
-              <w:bottom w:type="dxa" w:w="80"/>
-              <w:right w:type="dxa" w:w="120"/>
-            </w:tcMar>
-          </w:tcPr>
-          <w:p>
-            <w:r>
-              <w:rPr>
-                <w:b w:val="false"/>
-                <w:bCs w:val="false"/>
-              </w:rPr>
-              <w:t xml:space="preserve">Foundation live</w:t>
-            </w:r>
-          </w:p>
-        </w:tc>
-        <w:tc>
-          <w:tcPr>
-            <w:tcW w:type="dxa" w:w="5160"/>
-            <w:tcBorders>
-              <w:top w:val="single" w:color="CCCCCC" w:sz="1"/>
-              <w:left w:val="single" w:color="CCCCCC" w:sz="1"/>
-              <w:bottom w:val="single" w:color="CCCCCC" w:sz="1"/>
-              <w:right w:val="single" w:color="CCCCCC" w:sz="1"/>
-            </w:tcBorders>
-            <w:tcMar>
-              <w:top w:type="dxa" w:w="80"/>
-              <w:left w:type="dxa" w:w="120"/>
-              <w:bottom w:type="dxa" w:w="80"/>
-              <w:right w:type="dxa" w:w="120"/>
-            </w:tcMar>
-          </w:tcPr>
-          <w:p>
-            <w:r>
-              <w:rPr>
-                <w:b w:val="false"/>
-                <w:bCs w:val="false"/>
-              </w:rPr>
-              <w:t xml:space="preserve">Versioned content, approval governance, role-based security, CRM</w:t>
+            <w:tcW w:type="dxa" w:w="1700"/>
+            <w:tcBorders>
+              <w:top w:val="single" w:color="CCCCCC" w:sz="1"/>
+              <w:left w:val="single" w:color="CCCCCC" w:sz="1"/>
+              <w:bottom w:val="single" w:color="CCCCCC" w:sz="1"/>
+              <w:right w:val="single" w:color="CCCCCC" w:sz="1"/>
+            </w:tcBorders>
+            <w:tcMar>
+              <w:top w:type="dxa" w:w="80"/>
+              <w:left w:type="dxa" w:w="120"/>
+              <w:bottom w:type="dxa" w:w="80"/>
+              <w:right w:type="dxa" w:w="120"/>
+            </w:tcMar>
+          </w:tcPr>
+          <w:p>
+            <w:r>
+              <w:rPr>
+                <w:b w:val="false"/>
+                <w:bCs w:val="false"/>
+              </w:rPr>
+              <w:t xml:space="preserve">Live</w:t>
+            </w:r>
+          </w:p>
+        </w:tc>
+        <w:tc>
+          <w:tcPr>
+            <w:tcW w:type="dxa" w:w="4960"/>
+            <w:tcBorders>
+              <w:top w:val="single" w:color="CCCCCC" w:sz="1"/>
+              <w:left w:val="single" w:color="CCCCCC" w:sz="1"/>
+              <w:bottom w:val="single" w:color="CCCCCC" w:sz="1"/>
+              <w:right w:val="single" w:color="CCCCCC" w:sz="1"/>
+            </w:tcBorders>
+            <w:tcMar>
+              <w:top w:type="dxa" w:w="80"/>
+              <w:left w:type="dxa" w:w="120"/>
+              <w:bottom w:type="dxa" w:w="80"/>
+              <w:right w:type="dxa" w:w="120"/>
+            </w:tcMar>
+          </w:tcPr>
+          <w:p>
+            <w:r>
+              <w:rPr>
+                <w:b w:val="false"/>
+                <w:bCs w:val="false"/>
+              </w:rPr>
+              <w:t xml:space="preserve">Versioned content, approval governance, role-based security</w:t>
             </w:r>
           </w:p>
         </w:tc>
@@ -713,79 +767,159 @@
       <w:tr>
         <w:tc>
           <w:tcPr>
-            <w:tcW w:type="dxa" w:w="2600"/>
-            <w:tcBorders>
-              <w:top w:val="single" w:color="CCCCCC" w:sz="1"/>
-              <w:left w:val="single" w:color="CCCCCC" w:sz="1"/>
-              <w:bottom w:val="single" w:color="CCCCCC" w:sz="1"/>
-              <w:right w:val="single" w:color="CCCCCC" w:sz="1"/>
-            </w:tcBorders>
-            <w:tcMar>
-              <w:top w:type="dxa" w:w="80"/>
-              <w:left w:type="dxa" w:w="120"/>
-              <w:bottom w:type="dxa" w:w="80"/>
-              <w:right w:type="dxa" w:w="120"/>
-            </w:tcMar>
-          </w:tcPr>
-          <w:p>
-            <w:r>
-              <w:rPr>
-                <w:b w:val="false"/>
-                <w:bCs w:val="false"/>
-              </w:rPr>
-              <w:t xml:space="preserve">Education Bot</w:t>
-            </w:r>
-          </w:p>
-        </w:tc>
-        <w:tc>
-          <w:tcPr>
-            <w:tcW w:type="dxa" w:w="1600"/>
-            <w:tcBorders>
-              <w:top w:val="single" w:color="CCCCCC" w:sz="1"/>
-              <w:left w:val="single" w:color="CCCCCC" w:sz="1"/>
-              <w:bottom w:val="single" w:color="CCCCCC" w:sz="1"/>
-              <w:right w:val="single" w:color="CCCCCC" w:sz="1"/>
-            </w:tcBorders>
-            <w:tcMar>
-              <w:top w:type="dxa" w:w="80"/>
-              <w:left w:type="dxa" w:w="120"/>
-              <w:bottom w:type="dxa" w:w="80"/>
-              <w:right w:type="dxa" w:w="120"/>
-            </w:tcMar>
-          </w:tcPr>
-          <w:p>
-            <w:r>
-              <w:rPr>
-                <w:b w:val="false"/>
-                <w:bCs w:val="false"/>
-              </w:rPr>
-              <w:t xml:space="preserve">In build</w:t>
-            </w:r>
-          </w:p>
-        </w:tc>
-        <w:tc>
-          <w:tcPr>
-            <w:tcW w:type="dxa" w:w="5160"/>
-            <w:tcBorders>
-              <w:top w:val="single" w:color="CCCCCC" w:sz="1"/>
-              <w:left w:val="single" w:color="CCCCCC" w:sz="1"/>
-              <w:bottom w:val="single" w:color="CCCCCC" w:sz="1"/>
-              <w:right w:val="single" w:color="CCCCCC" w:sz="1"/>
-            </w:tcBorders>
-            <w:tcMar>
-              <w:top w:type="dxa" w:w="80"/>
-              <w:left w:type="dxa" w:w="120"/>
-              <w:bottom w:type="dxa" w:w="80"/>
-              <w:right w:type="dxa" w:w="120"/>
-            </w:tcMar>
-          </w:tcPr>
-          <w:p>
-            <w:r>
-              <w:rPr>
-                <w:b w:val="false"/>
-                <w:bCs w:val="false"/>
-              </w:rPr>
-              <w:t xml:space="preserve">Gated 30-day structured trading course</w:t>
+            <w:tcW w:type="dxa" w:w="2700"/>
+            <w:tcBorders>
+              <w:top w:val="single" w:color="CCCCCC" w:sz="1"/>
+              <w:left w:val="single" w:color="CCCCCC" w:sz="1"/>
+              <w:bottom w:val="single" w:color="CCCCCC" w:sz="1"/>
+              <w:right w:val="single" w:color="CCCCCC" w:sz="1"/>
+            </w:tcBorders>
+            <w:tcMar>
+              <w:top w:type="dxa" w:w="80"/>
+              <w:left w:type="dxa" w:w="120"/>
+              <w:bottom w:type="dxa" w:w="80"/>
+              <w:right w:type="dxa" w:w="120"/>
+            </w:tcMar>
+          </w:tcPr>
+          <w:p>
+            <w:r>
+              <w:rPr>
+                <w:b w:val="false"/>
+                <w:bCs w:val="false"/>
+              </w:rPr>
+              <w:t xml:space="preserve">CRM (Phase 1)</w:t>
+            </w:r>
+          </w:p>
+        </w:tc>
+        <w:tc>
+          <w:tcPr>
+            <w:tcW w:type="dxa" w:w="1700"/>
+            <w:tcBorders>
+              <w:top w:val="single" w:color="CCCCCC" w:sz="1"/>
+              <w:left w:val="single" w:color="CCCCCC" w:sz="1"/>
+              <w:bottom w:val="single" w:color="CCCCCC" w:sz="1"/>
+              <w:right w:val="single" w:color="CCCCCC" w:sz="1"/>
+            </w:tcBorders>
+            <w:tcMar>
+              <w:top w:type="dxa" w:w="80"/>
+              <w:left w:type="dxa" w:w="120"/>
+              <w:bottom w:type="dxa" w:w="80"/>
+              <w:right w:type="dxa" w:w="120"/>
+            </w:tcMar>
+          </w:tcPr>
+          <w:p>
+            <w:r>
+              <w:rPr>
+                <w:b w:val="false"/>
+                <w:bCs w:val="false"/>
+              </w:rPr>
+              <w:t xml:space="preserve">Live</w:t>
+            </w:r>
+          </w:p>
+        </w:tc>
+        <w:tc>
+          <w:tcPr>
+            <w:tcW w:type="dxa" w:w="4960"/>
+            <w:tcBorders>
+              <w:top w:val="single" w:color="CCCCCC" w:sz="1"/>
+              <w:left w:val="single" w:color="CCCCCC" w:sz="1"/>
+              <w:bottom w:val="single" w:color="CCCCCC" w:sz="1"/>
+              <w:right w:val="single" w:color="CCCCCC" w:sz="1"/>
+            </w:tcBorders>
+            <w:tcMar>
+              <w:top w:type="dxa" w:w="80"/>
+              <w:left w:type="dxa" w:w="120"/>
+              <w:bottom w:type="dxa" w:w="80"/>
+              <w:right w:type="dxa" w:w="120"/>
+            </w:tcMar>
+          </w:tcPr>
+          <w:p>
+            <w:r>
+              <w:rPr>
+                <w:b w:val="false"/>
+                <w:bCs w:val="false"/>
+              </w:rPr>
+              <w:t xml:space="preserve">Pipeline, lead profiles, tasks, dashboard, auto lead capture</w:t>
+            </w:r>
+          </w:p>
+        </w:tc>
+      </w:tr>
+      <w:tr>
+        <w:tc>
+          <w:tcPr>
+            <w:tcW w:type="dxa" w:w="2700"/>
+            <w:tcBorders>
+              <w:top w:val="single" w:color="CCCCCC" w:sz="1"/>
+              <w:left w:val="single" w:color="CCCCCC" w:sz="1"/>
+              <w:bottom w:val="single" w:color="CCCCCC" w:sz="1"/>
+              <w:right w:val="single" w:color="CCCCCC" w:sz="1"/>
+            </w:tcBorders>
+            <w:tcMar>
+              <w:top w:type="dxa" w:w="80"/>
+              <w:left w:type="dxa" w:w="120"/>
+              <w:bottom w:type="dxa" w:w="80"/>
+              <w:right w:type="dxa" w:w="120"/>
+            </w:tcMar>
+          </w:tcPr>
+          <w:p>
+            <w:r>
+              <w:rPr>
+                <w:b w:val="false"/>
+                <w:bCs w:val="false"/>
+              </w:rPr>
+              <w:t xml:space="preserve">Education System</w:t>
+            </w:r>
+          </w:p>
+        </w:tc>
+        <w:tc>
+          <w:tcPr>
+            <w:tcW w:type="dxa" w:w="1700"/>
+            <w:tcBorders>
+              <w:top w:val="single" w:color="CCCCCC" w:sz="1"/>
+              <w:left w:val="single" w:color="CCCCCC" w:sz="1"/>
+              <w:bottom w:val="single" w:color="CCCCCC" w:sz="1"/>
+              <w:right w:val="single" w:color="CCCCCC" w:sz="1"/>
+            </w:tcBorders>
+            <w:tcMar>
+              <w:top w:type="dxa" w:w="80"/>
+              <w:left w:type="dxa" w:w="120"/>
+              <w:bottom w:type="dxa" w:w="80"/>
+              <w:right w:type="dxa" w:w="120"/>
+            </w:tcMar>
+          </w:tcPr>
+          <w:p>
+            <w:r>
+              <w:rPr>
+                <w:b w:val="false"/>
+                <w:bCs w:val="false"/>
+              </w:rPr>
+              <w:t xml:space="preserve">Authoring-ready</w:t>
+            </w:r>
+          </w:p>
+        </w:tc>
+        <w:tc>
+          <w:tcPr>
+            <w:tcW w:type="dxa" w:w="4960"/>
+            <w:tcBorders>
+              <w:top w:val="single" w:color="CCCCCC" w:sz="1"/>
+              <w:left w:val="single" w:color="CCCCCC" w:sz="1"/>
+              <w:bottom w:val="single" w:color="CCCCCC" w:sz="1"/>
+              <w:right w:val="single" w:color="CCCCCC" w:sz="1"/>
+            </w:tcBorders>
+            <w:tcMar>
+              <w:top w:type="dxa" w:w="80"/>
+              <w:left w:type="dxa" w:w="120"/>
+              <w:bottom w:type="dxa" w:w="80"/>
+              <w:right w:type="dxa" w:w="120"/>
+            </w:tcMar>
+          </w:tcPr>
+          <w:p>
+            <w:r>
+              <w:rPr>
+                <w:b w:val="false"/>
+                <w:bCs w:val="false"/>
+              </w:rPr>
+              <w:t xml:space="preserve">30-day gated course pipeline</w:t>
             </w:r>
           </w:p>
         </w:tc>
@@ -797,14 +931,6 @@
       </w:pPr>
       <w:r>
         <w:t xml:space="preserve">Engineering depth</w:t>
-      </w:r>
-    </w:p>
-    <w:p>
-      <w:pPr>
-        <w:spacing w:after="140"/>
-      </w:pPr>
-      <w:r>
-        <w:t xml:space="preserve">The platform reflects substantial, deliberate engineering — not an off-the-shelf assembly. Highlights of the work involved:</w:t>
       </w:r>
     </w:p>
     <w:tbl>
@@ -904,7 +1030,7 @@
                 <w:b w:val="false"/>
                 <w:bCs w:val="false"/>
               </w:rPr>
-              <w:t xml:space="preserve">Distributed architecture</w:t>
+              <w:t xml:space="preserve">Single owned data platform</w:t>
             </w:r>
           </w:p>
         </w:tc>
@@ -930,7 +1056,7 @@
                 <w:b w:val="false"/>
                 <w:bCs w:val="false"/>
               </w:rPr>
-              <w:t xml:space="preserve">Multiple always-on services coordinated through a shared cloud database, deployed via automated pipelines.</w:t>
+              <w:t xml:space="preserve">Marketing, community, lead and content data unified in one secured database — not fragmented across rented SaaS tools.</w:t>
             </w:r>
           </w:p>
         </w:tc>
@@ -984,7 +1110,7 @@
                 <w:b w:val="false"/>
                 <w:bCs w:val="false"/>
               </w:rPr>
-              <w:t xml:space="preserve">LLM integration wrapped in a human-in-the-loop approval layer with timed automatic fallback — fast, but never unsupervised.</w:t>
+              <w:t xml:space="preserve">AI integrated behind a human-in-the-loop approval layer with timed fallback — fast, never unsupervised.</w:t>
             </w:r>
           </w:p>
         </w:tc>
@@ -1012,7 +1138,7 @@
                 <w:b w:val="false"/>
                 <w:bCs w:val="false"/>
               </w:rPr>
-              <w:t xml:space="preserve">Database security</w:t>
+              <w:t xml:space="preserve">Database-level security</w:t>
             </w:r>
           </w:p>
         </w:tc>
@@ -1038,7 +1164,7 @@
                 <w:b w:val="false"/>
                 <w:bCs w:val="false"/>
               </w:rPr>
-              <w:t xml:space="preserve">Row-level security across every table, role-based permissions, and a tamper-evident audit log.</w:t>
+              <w:t xml:space="preserve">Row-level security across every table, role-based permissions, and an audit log.</w:t>
             </w:r>
           </w:p>
         </w:tc>
@@ -1066,7 +1192,7 @@
                 <w:b w:val="false"/>
                 <w:bCs w:val="false"/>
               </w:rPr>
-              <w:t xml:space="preserve">Governance workflow</w:t>
+              <w:t xml:space="preserve">Governed content pipeline</w:t>
             </w:r>
           </w:p>
         </w:tc>
@@ -1092,7 +1218,7 @@
                 <w:b w:val="false"/>
                 <w:bCs w:val="false"/>
               </w:rPr>
-              <w:t xml:space="preserve">A draft → submit → approve → publish content pipeline with full version history and one-click rollback.</w:t>
+              <w:t xml:space="preserve">Draft → submit → approve → publish, with version history and rollback.</w:t>
             </w:r>
           </w:p>
         </w:tc>
@@ -1120,7 +1246,7 @@
                 <w:b w:val="false"/>
                 <w:bCs w:val="false"/>
               </w:rPr>
-              <w:t xml:space="preserve">Resilience</w:t>
+              <w:t xml:space="preserve">Automated lead capture</w:t>
             </w:r>
           </w:p>
         </w:tc>
@@ -1146,7 +1272,7 @@
                 <w:b w:val="false"/>
                 <w:bCs w:val="false"/>
               </w:rPr>
-              <w:t xml:space="preserve">Self-healing fallbacks: if the database is unreachable, the bots continue running on safe built-in defaults.</w:t>
+              <w:t xml:space="preserve">One secure intake endpoint with auto-scoring and de-duplication, feeding the CRM from many channels.</w:t>
             </w:r>
           </w:p>
         </w:tc>
@@ -1174,7 +1300,7 @@
                 <w:b w:val="false"/>
                 <w:bCs w:val="false"/>
               </w:rPr>
-              <w:t xml:space="preserve">Bilingual by design</w:t>
+              <w:t xml:space="preserve">Resilience</w:t>
             </w:r>
           </w:p>
         </w:tc>
@@ -1200,7 +1326,7 @@
                 <w:b w:val="false"/>
                 <w:bCs w:val="false"/>
               </w:rPr>
-              <w:t xml:space="preserve">Every member-facing message maintained in English and Simplified Chinese throughout.</w:t>
+              <w:t xml:space="preserve">Self-healing fallbacks: if the database is unreachable, the bots keep running on safe defaults.</w:t>
             </w:r>
           </w:p>
         </w:tc>
@@ -1211,7 +1337,67 @@
         <w:pStyle w:val="Heading1"/>
       </w:pPr>
       <w:r>
-        <w:t xml:space="preserve">Security &amp; governance</w:t>
+        <w:t xml:space="preserve">Why this is a defensible asset</w:t>
+      </w:r>
+    </w:p>
+    <w:p>
+      <w:pPr>
+        <w:pStyle w:val="ListParagraph"/>
+        <w:numPr>
+          <w:ilvl w:val="0"/>
+          <w:numId w:val="2"/>
+        </w:numPr>
+        <w:spacing w:after="60"/>
+      </w:pPr>
+      <w:r>
+        <w:t xml:space="preserve">Owned infrastructure, not rented: the data, the automation and the CRM are proprietary and reusable, not a monthly SaaS subscription EBI can be priced out of.</w:t>
+      </w:r>
+    </w:p>
+    <w:p>
+      <w:pPr>
+        <w:pStyle w:val="ListParagraph"/>
+        <w:numPr>
+          <w:ilvl w:val="0"/>
+          <w:numId w:val="2"/>
+        </w:numPr>
+        <w:spacing w:after="60"/>
+      </w:pPr>
+      <w:r>
+        <w:t xml:space="preserve">Unification is the moat: a generic CRM cannot see a member's community engagement or trading journey; this platform can, in one place.</w:t>
+      </w:r>
+    </w:p>
+    <w:p>
+      <w:pPr>
+        <w:pStyle w:val="ListParagraph"/>
+        <w:numPr>
+          <w:ilvl w:val="0"/>
+          <w:numId w:val="2"/>
+        </w:numPr>
+        <w:spacing w:after="60"/>
+      </w:pPr>
+      <w:r>
+        <w:t xml:space="preserve">Built for scale without proportional headcount: automation and governed self-service let a small team serve thousands of members.</w:t>
+      </w:r>
+    </w:p>
+    <w:p>
+      <w:pPr>
+        <w:pStyle w:val="ListParagraph"/>
+        <w:numPr>
+          <w:ilvl w:val="0"/>
+          <w:numId w:val="2"/>
+        </w:numPr>
+        <w:spacing w:after="60"/>
+      </w:pPr>
+      <w:r>
+        <w:t xml:space="preserve">Trading-native: the pipeline, vocabulary and education map directly to a forex/gold business rather than being forced into a generic template.</w:t>
+      </w:r>
+    </w:p>
+    <w:p>
+      <w:pPr>
+        <w:pStyle w:val="Heading1"/>
+      </w:pPr>
+      <w:r>
+        <w:t xml:space="preserve">Roadmap</w:t>
       </w:r>
     </w:p>
     <w:p>
@@ -1219,59 +1405,33 @@
         <w:spacing w:after="140"/>
       </w:pPr>
       <w:r>
-        <w:t xml:space="preserve">The system was built so that control never leaves the owner, and so that growing the team never widens the attack surface:</w:t>
-      </w:r>
-    </w:p>
-    <w:p>
-      <w:pPr>
-        <w:pStyle w:val="ListParagraph"/>
-        <w:numPr>
-          <w:ilvl w:val="0"/>
-          <w:numId w:val="2"/>
-        </w:numPr>
-        <w:spacing w:after="60"/>
-      </w:pPr>
-      <w:r>
-        <w:t xml:space="preserve">Single-owner authority: one approver signs off on all public content; team members can contribute but cannot publish.</w:t>
-      </w:r>
-    </w:p>
-    <w:p>
-      <w:pPr>
-        <w:pStyle w:val="ListParagraph"/>
-        <w:numPr>
-          <w:ilvl w:val="0"/>
-          <w:numId w:val="2"/>
-        </w:numPr>
-        <w:spacing w:after="60"/>
-      </w:pPr>
-      <w:r>
-        <w:t xml:space="preserve">Database-enforced permissions — security does not rely on the user interface; it is enforced at the data layer.</w:t>
-      </w:r>
-    </w:p>
-    <w:p>
-      <w:pPr>
-        <w:pStyle w:val="ListParagraph"/>
-        <w:numPr>
-          <w:ilvl w:val="0"/>
-          <w:numId w:val="2"/>
-        </w:numPr>
-        <w:spacing w:after="60"/>
-      </w:pPr>
-      <w:r>
-        <w:t xml:space="preserve">Secrets isolation: API keys and tokens are held in the secured runtime environment, never in the application or the browser.</w:t>
-      </w:r>
-    </w:p>
-    <w:p>
-      <w:pPr>
-        <w:pStyle w:val="ListParagraph"/>
-        <w:numPr>
-          <w:ilvl w:val="0"/>
-          <w:numId w:val="2"/>
-        </w:numPr>
-        <w:spacing w:after="60"/>
-      </w:pPr>
-      <w:r>
-        <w:t xml:space="preserve">Full auditability: every change, submission and approval is logged with author and timestamp.</w:t>
+        <w:t xml:space="preserve">Phase 1 (the operating core) is delivered. The path ahead compounds its value:</w:t>
+      </w:r>
+    </w:p>
+    <w:p>
+      <w:pPr>
+        <w:pStyle w:val="ListParagraph"/>
+        <w:numPr>
+          <w:ilvl w:val="0"/>
+          <w:numId w:val="2"/>
+        </w:numPr>
+        <w:spacing w:after="60"/>
+      </w:pPr>
+      <w:r>
+        <w:t xml:space="preserve">Phase 2 — revenue &amp; retention: communication centre, automation engine, support desk, marketing analytics, IB/referral management, and a deposit/revenue dashboard (dependent on broker data integration).</w:t>
+      </w:r>
+    </w:p>
+    <w:p>
+      <w:pPr>
+        <w:pStyle w:val="ListParagraph"/>
+        <w:numPr>
+          <w:ilvl w:val="0"/>
+          <w:numId w:val="2"/>
+        </w:numPr>
+        <w:spacing w:after="60"/>
+      </w:pPr>
+      <w:r>
+        <w:t xml:space="preserve">Phase 3 — enterprise: client portal, advanced BI, AI assistance (churn prediction, next-best-action), multi-brand support and mobile.</w:t>
       </w:r>
     </w:p>
     <w:p>
@@ -1279,7 +1439,7 @@
         <w:pStyle w:val="Heading1"/>
       </w:pPr>
       <w:r>
-        <w:t xml:space="preserve">Roadmap</w:t>
+        <w:t xml:space="preserve">Honest note for diligence</w:t>
       </w:r>
     </w:p>
     <w:p>
@@ -1287,75 +1447,7 @@
         <w:spacing w:after="140"/>
       </w:pPr>
       <w:r>
-        <w:t xml:space="preserve">The foundation is in place; the path ahead compounds its value:</w:t>
-      </w:r>
-    </w:p>
-    <w:p>
-      <w:pPr>
-        <w:pStyle w:val="ListParagraph"/>
-        <w:numPr>
-          <w:ilvl w:val="0"/>
-          <w:numId w:val="2"/>
-        </w:numPr>
-        <w:spacing w:after="60"/>
-      </w:pPr>
-      <w:r>
-        <w:t xml:space="preserve">Complete the team-facing admin website (browser-based content, approvals, settings and CRM).</w:t>
-      </w:r>
-    </w:p>
-    <w:p>
-      <w:pPr>
-        <w:pStyle w:val="ListParagraph"/>
-        <w:numPr>
-          <w:ilvl w:val="0"/>
-          <w:numId w:val="2"/>
-        </w:numPr>
-        <w:spacing w:after="60"/>
-      </w:pPr>
-      <w:r>
-        <w:t xml:space="preserve">Launch the 30-day Education Bot to drive retention and upsell.</w:t>
-      </w:r>
-    </w:p>
-    <w:p>
-      <w:pPr>
-        <w:pStyle w:val="ListParagraph"/>
-        <w:numPr>
-          <w:ilvl w:val="0"/>
-          <w:numId w:val="2"/>
-        </w:numPr>
-        <w:spacing w:after="60"/>
-      </w:pPr>
-      <w:r>
-        <w:t xml:space="preserve">Activate the integrated CRM as the team’s daily client-management workspace.</w:t>
-      </w:r>
-    </w:p>
-    <w:p>
-      <w:pPr>
-        <w:pStyle w:val="ListParagraph"/>
-        <w:numPr>
-          <w:ilvl w:val="0"/>
-          <w:numId w:val="2"/>
-        </w:numPr>
-        <w:spacing w:after="60"/>
-      </w:pPr>
-      <w:r>
-        <w:t xml:space="preserve">Extend the intelligence engine and add further automation, gamification and multi-language reach.</w:t>
-      </w:r>
-    </w:p>
-    <w:p>
-      <w:pPr>
-        <w:pStyle w:val="Heading1"/>
-      </w:pPr>
-      <w:r>
-        <w:t xml:space="preserve">Why this matters</w:t>
-      </w:r>
-    </w:p>
-    <w:p>
-      <w:pPr>
-        <w:spacing w:after="140"/>
-      </w:pPr>
-      <w:r>
-        <w:t xml:space="preserve">Most trading communities run on manual effort and ad-hoc tools. EBI has instead built durable infrastructure: an automated content and intelligence engine, a governed operating platform, and a learning system — all proprietary, all reusable, and all designed to scale to thousands of members without a proportional increase in staff. This is the difference between a community and a compounding platform business.</w:t>
+        <w:t xml:space="preserve">This report describes capability delivered, not traction claims. Member and revenue figures are deliberately omitted here so that every statement withstands verification. The one external dependency worth noting: deposit and trading-volume reporting requires integration with the broker's data, which is on the Phase 2 roadmap.</w:t>
       </w:r>
     </w:p>
     <w:sectPr>

</xml_diff>